<commit_message>
Update GORAT KiCad PCB, schematics & backups
Modify KiCad project files and update backup archives. Changes include:
- Updated Build_Guide.docx (binary change).
- Removed several older GORAT backup ZIPs and added new backups dated 2026-04-01.
- Extensive edits to GORAT circuit diagram.kicad_pcb: net renumbering/reassignments, footprint position adjustments, pad/net fixes, updated pad/net mappings, many UUID/fp_line/fp_poly/attribute adjustments, and a footprint rename (3PDT -> 3PDT_fixed).
- Minor updates to GORAT circuit diagram.kicad_prl, .kicad_sch and fp-info-cache.
These changes appear to realign component placements and correct net assignments in the PCB while refreshing project backups.
</commit_message>
<xml_diff>
--- a/Build_Guide.docx
+++ b/Build_Guide.docx
@@ -7492,6 +7492,271 @@
     <w:p>
       <w:r>
         <w:t>Leave the connections between boards, and with the off-board components (audio and power jacks), they will be added last.</w:t>
+      </w:r>
+    </w:p>
+    <w:p>
+      <w:pPr>
+        <w:rPr>
+          <w:b/>
+          <w:bCs/>
+          <w:color w:val="FF0000"/>
+        </w:rPr>
+      </w:pPr>
+    </w:p>
+    <w:p>
+      <w:r>
+        <w:rPr>
+          <w:b/>
+          <w:bCs/>
+          <w:color w:val="FF0000"/>
+        </w:rPr>
+        <w:t>FIXES FOR VERSION 1.2:</w:t>
+      </w:r>
+    </w:p>
+    <w:p>
+      <w:pPr>
+        <w:pStyle w:val="ListParagraph"/>
+        <w:numPr>
+          <w:ilvl w:val="0"/>
+          <w:numId w:val="1"/>
+        </w:numPr>
+        <w:rPr>
+          <w:highlight w:val="green"/>
+        </w:rPr>
+      </w:pPr>
+      <w:r>
+        <w:rPr>
+          <w:highlight w:val="green"/>
+        </w:rPr>
+        <w:t xml:space="preserve">Connection from </w:t>
+      </w:r>
+      <w:r>
+        <w:rPr>
+          <w:highlight w:val="green"/>
+        </w:rPr>
+        <w:t>C1(1) and J3(4), and between C19(2) and J3(5)</w:t>
+      </w:r>
+      <w:r>
+        <w:rPr>
+          <w:highlight w:val="green"/>
+        </w:rPr>
+        <w:t>, signal in and out of circuit.</w:t>
+      </w:r>
+    </w:p>
+    <w:p>
+      <w:pPr>
+        <w:pStyle w:val="ListParagraph"/>
+        <w:numPr>
+          <w:ilvl w:val="0"/>
+          <w:numId w:val="1"/>
+        </w:numPr>
+      </w:pPr>
+      <w:r>
+        <w:t>Test points</w:t>
+      </w:r>
+      <w:r>
+        <w:t xml:space="preserve"> more </w:t>
+      </w:r>
+      <w:proofErr w:type="gramStart"/>
+      <w:r>
+        <w:t>obvious?</w:t>
+      </w:r>
+      <w:proofErr w:type="gramEnd"/>
+    </w:p>
+    <w:p>
+      <w:pPr>
+        <w:pStyle w:val="ListParagraph"/>
+        <w:numPr>
+          <w:ilvl w:val="0"/>
+          <w:numId w:val="1"/>
+        </w:numPr>
+        <w:rPr>
+          <w:highlight w:val="green"/>
+        </w:rPr>
+      </w:pPr>
+      <w:r>
+        <w:rPr>
+          <w:highlight w:val="green"/>
+        </w:rPr>
+        <w:t>Rotary switch footprints (</w:t>
+      </w:r>
+      <w:proofErr w:type="gramStart"/>
+      <w:r>
+        <w:rPr>
+          <w:highlight w:val="green"/>
+        </w:rPr>
+        <w:t>A,B</w:t>
+      </w:r>
+      <w:proofErr w:type="gramEnd"/>
+      <w:r>
+        <w:rPr>
+          <w:highlight w:val="green"/>
+        </w:rPr>
+        <w:t>,</w:t>
+      </w:r>
+      <w:proofErr w:type="gramStart"/>
+      <w:r>
+        <w:rPr>
+          <w:highlight w:val="green"/>
+        </w:rPr>
+        <w:t>C,D</w:t>
+      </w:r>
+      <w:proofErr w:type="gramEnd"/>
+      <w:r>
+        <w:rPr>
+          <w:highlight w:val="green"/>
+        </w:rPr>
+        <w:t>, get placement correct, line up pin 1)</w:t>
+      </w:r>
+    </w:p>
+    <w:p>
+      <w:pPr>
+        <w:pStyle w:val="ListParagraph"/>
+        <w:numPr>
+          <w:ilvl w:val="0"/>
+          <w:numId w:val="1"/>
+        </w:numPr>
+        <w:rPr>
+          <w:highlight w:val="green"/>
+        </w:rPr>
+      </w:pPr>
+      <w:r>
+        <w:rPr>
+          <w:highlight w:val="green"/>
+        </w:rPr>
+        <w:t xml:space="preserve">Move most components to underside of board, should make </w:t>
+      </w:r>
+      <w:r>
+        <w:rPr>
+          <w:highlight w:val="green"/>
+        </w:rPr>
+        <w:t xml:space="preserve">for easier troubleshooting and </w:t>
+      </w:r>
+      <w:r>
+        <w:rPr>
+          <w:highlight w:val="green"/>
+        </w:rPr>
+        <w:t>less cramped.</w:t>
+      </w:r>
+    </w:p>
+    <w:p>
+      <w:pPr>
+        <w:pStyle w:val="ListParagraph"/>
+        <w:numPr>
+          <w:ilvl w:val="0"/>
+          <w:numId w:val="1"/>
+        </w:numPr>
+        <w:rPr>
+          <w:highlight w:val="green"/>
+        </w:rPr>
+      </w:pPr>
+      <w:r>
+        <w:rPr>
+          <w:highlight w:val="green"/>
+        </w:rPr>
+        <w:t>Better order of diode selection (not switching both diodes at once)</w:t>
+      </w:r>
+    </w:p>
+    <w:p>
+      <w:pPr>
+        <w:pStyle w:val="ListParagraph"/>
+        <w:numPr>
+          <w:ilvl w:val="0"/>
+          <w:numId w:val="1"/>
+        </w:numPr>
+      </w:pPr>
+      <w:r>
+        <w:t xml:space="preserve">Potentiometer directionality, </w:t>
+      </w:r>
+      <w:r>
+        <w:rPr>
+          <w:highlight w:val="green"/>
+        </w:rPr>
+        <w:t>Gain, Filter</w:t>
+      </w:r>
+    </w:p>
+    <w:p>
+      <w:pPr>
+        <w:pStyle w:val="ListParagraph"/>
+        <w:numPr>
+          <w:ilvl w:val="0"/>
+          <w:numId w:val="1"/>
+        </w:numPr>
+        <w:rPr>
+          <w:highlight w:val="green"/>
+        </w:rPr>
+      </w:pPr>
+      <w:r>
+        <w:rPr>
+          <w:highlight w:val="green"/>
+        </w:rPr>
+        <w:t xml:space="preserve">Wet/Dry functionality (buffer was </w:t>
+      </w:r>
+      <w:r>
+        <w:rPr>
+          <w:highlight w:val="green"/>
+        </w:rPr>
+        <w:t>in wrong configuration, input into -)</w:t>
+      </w:r>
+    </w:p>
+    <w:p>
+      <w:pPr>
+        <w:pStyle w:val="ListParagraph"/>
+        <w:numPr>
+          <w:ilvl w:val="0"/>
+          <w:numId w:val="1"/>
+        </w:numPr>
+      </w:pPr>
+      <w:r>
+        <w:t>Silkscreens, some components were missing</w:t>
+      </w:r>
+    </w:p>
+    <w:p>
+      <w:pPr>
+        <w:pStyle w:val="ListParagraph"/>
+        <w:numPr>
+          <w:ilvl w:val="0"/>
+          <w:numId w:val="1"/>
+        </w:numPr>
+        <w:rPr>
+          <w:highlight w:val="green"/>
+        </w:rPr>
+      </w:pPr>
+      <w:r>
+        <w:rPr>
+          <w:highlight w:val="green"/>
+        </w:rPr>
+        <w:t>Soft/hard clipping switch</w:t>
+      </w:r>
+    </w:p>
+    <w:p>
+      <w:pPr>
+        <w:pStyle w:val="ListParagraph"/>
+        <w:numPr>
+          <w:ilvl w:val="0"/>
+          <w:numId w:val="1"/>
+        </w:numPr>
+      </w:pPr>
+      <w:r>
+        <w:t>Replace 2x6 diode selection switch with 1x12</w:t>
+      </w:r>
+      <w:r>
+        <w:t xml:space="preserve"> as the two poles are connected anyway and this could allow 12 different diode type pairings</w:t>
+      </w:r>
+    </w:p>
+    <w:p>
+      <w:pPr>
+        <w:pStyle w:val="ListParagraph"/>
+        <w:numPr>
+          <w:ilvl w:val="0"/>
+          <w:numId w:val="1"/>
+        </w:numPr>
+      </w:pPr>
+      <w:r>
+        <w:t xml:space="preserve">Active treble cut/boost instead of passive filter, OR </w:t>
+      </w:r>
+      <w:r>
+        <w:t>implement tilt EQ (intense)</w:t>
       </w:r>
     </w:p>
     <w:p>
@@ -7609,6 +7874,7 @@
         <w:rPr>
           <w:noProof/>
         </w:rPr>
+        <w:lastRenderedPageBreak/>
         <w:drawing>
           <wp:inline distT="0" distB="0" distL="0" distR="0" wp14:anchorId="41069A26" wp14:editId="394C30E9">
             <wp:extent cx="5731510" cy="3949700"/>
@@ -7625,7 +7891,7 @@
                     <pic:cNvPicPr/>
                   </pic:nvPicPr>
                   <pic:blipFill>
-                    <a:blip r:embed="rId6"/>
+                    <a:blip r:embed="rId7"/>
                     <a:stretch>
                       <a:fillRect/>
                     </a:stretch>
@@ -7668,6 +7934,28 @@
           <w:sz w:val="28"/>
           <w:szCs w:val="28"/>
         </w:rPr>
+        <w:br w:type="page"/>
+      </w:r>
+    </w:p>
+    <w:p>
+      <w:pPr>
+        <w:rPr>
+          <w:rFonts w:asciiTheme="majorHAnsi" w:hAnsiTheme="majorHAnsi"/>
+          <w:b/>
+          <w:bCs/>
+          <w:sz w:val="28"/>
+          <w:szCs w:val="28"/>
+        </w:rPr>
+      </w:pPr>
+      <w:r>
+        <w:rPr>
+          <w:rFonts w:asciiTheme="majorHAnsi" w:hAnsiTheme="majorHAnsi"/>
+          <w:b/>
+          <w:bCs/>
+          <w:sz w:val="28"/>
+          <w:szCs w:val="28"/>
+        </w:rPr>
+        <w:lastRenderedPageBreak/>
         <w:t>Enclosure guide</w:t>
       </w:r>
     </w:p>
@@ -7710,6 +7998,28 @@
           <w:sz w:val="36"/>
           <w:szCs w:val="36"/>
         </w:rPr>
+        <w:br w:type="page"/>
+      </w:r>
+    </w:p>
+    <w:p>
+      <w:pPr>
+        <w:rPr>
+          <w:rFonts w:asciiTheme="majorHAnsi" w:hAnsiTheme="majorHAnsi"/>
+          <w:b/>
+          <w:bCs/>
+          <w:sz w:val="36"/>
+          <w:szCs w:val="36"/>
+        </w:rPr>
+      </w:pPr>
+      <w:r>
+        <w:rPr>
+          <w:rFonts w:asciiTheme="majorHAnsi" w:hAnsiTheme="majorHAnsi"/>
+          <w:b/>
+          <w:bCs/>
+          <w:sz w:val="36"/>
+          <w:szCs w:val="36"/>
+        </w:rPr>
+        <w:lastRenderedPageBreak/>
         <w:t>Top side</w:t>
       </w:r>
     </w:p>
@@ -7718,7 +8028,6 @@
         <w:rPr>
           <w:noProof/>
         </w:rPr>
-        <w:lastRenderedPageBreak/>
         <w:drawing>
           <wp:inline distT="0" distB="0" distL="0" distR="0" wp14:anchorId="4FE7FE5A" wp14:editId="117BDE1C">
             <wp:extent cx="5390515" cy="3585742"/>
@@ -7735,7 +8044,7 @@
                     <pic:cNvPicPr/>
                   </pic:nvPicPr>
                   <pic:blipFill rotWithShape="1">
-                    <a:blip r:embed="rId7"/>
+                    <a:blip r:embed="rId8"/>
                     <a:srcRect l="2660" t="1743" r="3279" b="4538"/>
                     <a:stretch>
                       <a:fillRect/>
@@ -7818,7 +8127,7 @@
                     <pic:cNvPicPr/>
                   </pic:nvPicPr>
                   <pic:blipFill rotWithShape="1">
-                    <a:blip r:embed="rId8"/>
+                    <a:blip r:embed="rId9"/>
                     <a:srcRect l="997" t="1158" r="6935" b="4359"/>
                     <a:stretch>
                       <a:fillRect/>
@@ -7850,6 +8159,12 @@
     </w:p>
     <w:p>
       <w:r>
+        <w:br w:type="page"/>
+      </w:r>
+    </w:p>
+    <w:p/>
+    <w:p>
+      <w:r>
         <w:rPr>
           <w:noProof/>
         </w:rPr>
@@ -7877,10 +8192,10 @@
                     <pic:cNvPicPr/>
                   </pic:nvPicPr>
                   <pic:blipFill>
-                    <a:blip r:embed="rId9">
+                    <a:blip r:embed="rId10">
                       <a:extLst>
                         <a:ext uri="{96DAC541-7B7A-43D3-8B79-37D633B846F1}">
-                          <asvg:svgBlip xmlns:asvg="http://schemas.microsoft.com/office/drawing/2016/SVG/main" r:embed="rId10"/>
+                          <asvg:svgBlip xmlns:asvg="http://schemas.microsoft.com/office/drawing/2016/SVG/main" r:embed="rId11"/>
                         </a:ext>
                       </a:extLst>
                     </a:blip>
@@ -7911,7 +8226,7 @@
       </w:r>
     </w:p>
     <w:sectPr>
-      <w:headerReference w:type="default" r:id="rId11"/>
+      <w:headerReference w:type="default" r:id="rId12"/>
       <w:pgSz w:w="11906" w:h="16838"/>
       <w:pgMar w:top="1440" w:right="1440" w:bottom="1440" w:left="1440" w:header="708" w:footer="708" w:gutter="0"/>
       <w:cols w:space="708"/>
@@ -8018,6 +8333,127 @@
     </w:r>
   </w:p>
 </w:hdr>
+</file>
+
+<file path=word/numbering.xml><?xml version="1.0" encoding="utf-8"?>
+<w:numbering xmlns:wpc="http://schemas.microsoft.com/office/word/2010/wordprocessingCanvas" xmlns:cx="http://schemas.microsoft.com/office/drawing/2014/chartex" xmlns:cx1="http://schemas.microsoft.com/office/drawing/2015/9/8/chartex" xmlns:cx2="http://schemas.microsoft.com/office/drawing/2015/10/21/chartex" xmlns:cx3="http://schemas.microsoft.com/office/drawing/2016/5/9/chartex" xmlns:cx4="http://schemas.microsoft.com/office/drawing/2016/5/10/chartex" xmlns:cx5="http://schemas.microsoft.com/office/drawing/2016/5/11/chartex" xmlns:cx6="http://schemas.microsoft.com/office/drawing/2016/5/12/chartex" xmlns:cx7="http://schemas.microsoft.com/office/drawing/2016/5/13/chartex" xmlns:cx8="http://schemas.microsoft.com/office/drawing/2016/5/14/chartex" xmlns:mc="http://schemas.openxmlformats.org/markup-compatibility/2006" xmlns:aink="http://schemas.microsoft.com/office/drawing/2016/ink" xmlns:am3d="http://schemas.microsoft.com/office/drawing/2017/model3d" xmlns:o="urn:schemas-microsoft-com:office:office" xmlns:oel="http://schemas.microsoft.com/office/2019/extlst" xmlns:r="http://schemas.openxmlformats.org/officeDocument/2006/relationships" xmlns:m="http://schemas.openxmlformats.org/officeDocument/2006/math" xmlns:v="urn:schemas-microsoft-com:vml" xmlns:wp14="http://schemas.microsoft.com/office/word/2010/wordprocessingDrawing" xmlns:wp="http://schemas.openxmlformats.org/drawingml/2006/wordprocessingDrawing" xmlns:w10="urn:schemas-microsoft-com:office:word" xmlns:w="http://schemas.openxmlformats.org/wordprocessingml/2006/main" xmlns:w14="http://schemas.microsoft.com/office/word/2010/wordml" xmlns:w15="http://schemas.microsoft.com/office/word/2012/wordml" xmlns:w16cex="http://schemas.microsoft.com/office/word/2018/wordml/cex" xmlns:w16cid="http://schemas.microsoft.com/office/word/2016/wordml/cid" xmlns:w16="http://schemas.microsoft.com/office/word/2018/wordml" xmlns:w16du="http://schemas.microsoft.com/office/word/2023/wordml/word16du" xmlns:w16sdtdh="http://schemas.microsoft.com/office/word/2020/wordml/sdtdatahash" xmlns:w16sdtfl="http://schemas.microsoft.com/office/word/2024/wordml/sdtformatlock" xmlns:w16se="http://schemas.microsoft.com/office/word/2015/wordml/symex" xmlns:wpg="http://schemas.microsoft.com/office/word/2010/wordprocessingGroup" xmlns:wpi="http://schemas.microsoft.com/office/word/2010/wordprocessingInk" xmlns:wne="http://schemas.microsoft.com/office/word/2006/wordml" xmlns:wps="http://schemas.microsoft.com/office/word/2010/wordprocessingShape" mc:Ignorable="w14 w15 w16se w16cid w16 w16cex w16sdtdh w16sdtfl w16du wp14">
+  <w:abstractNum w:abstractNumId="0" w15:restartNumberingAfterBreak="0">
+    <w:nsid w:val="29EB5A29"/>
+    <w:multiLevelType w:val="hybridMultilevel"/>
+    <w:tmpl w:val="5374137E"/>
+    <w:lvl w:ilvl="0" w:tplc="08090001">
+      <w:start w:val="1"/>
+      <w:numFmt w:val="bullet"/>
+      <w:lvlText w:val=""/>
+      <w:lvlJc w:val="left"/>
+      <w:pPr>
+        <w:ind w:left="720" w:hanging="360"/>
+      </w:pPr>
+      <w:rPr>
+        <w:rFonts w:ascii="Symbol" w:hAnsi="Symbol" w:hint="default"/>
+      </w:rPr>
+    </w:lvl>
+    <w:lvl w:ilvl="1" w:tplc="08090003" w:tentative="1">
+      <w:start w:val="1"/>
+      <w:numFmt w:val="bullet"/>
+      <w:lvlText w:val="o"/>
+      <w:lvlJc w:val="left"/>
+      <w:pPr>
+        <w:ind w:left="1440" w:hanging="360"/>
+      </w:pPr>
+      <w:rPr>
+        <w:rFonts w:ascii="Courier New" w:hAnsi="Courier New" w:cs="Courier New" w:hint="default"/>
+      </w:rPr>
+    </w:lvl>
+    <w:lvl w:ilvl="2" w:tplc="08090005" w:tentative="1">
+      <w:start w:val="1"/>
+      <w:numFmt w:val="bullet"/>
+      <w:lvlText w:val=""/>
+      <w:lvlJc w:val="left"/>
+      <w:pPr>
+        <w:ind w:left="2160" w:hanging="360"/>
+      </w:pPr>
+      <w:rPr>
+        <w:rFonts w:ascii="Wingdings" w:hAnsi="Wingdings" w:hint="default"/>
+      </w:rPr>
+    </w:lvl>
+    <w:lvl w:ilvl="3" w:tplc="08090001" w:tentative="1">
+      <w:start w:val="1"/>
+      <w:numFmt w:val="bullet"/>
+      <w:lvlText w:val=""/>
+      <w:lvlJc w:val="left"/>
+      <w:pPr>
+        <w:ind w:left="2880" w:hanging="360"/>
+      </w:pPr>
+      <w:rPr>
+        <w:rFonts w:ascii="Symbol" w:hAnsi="Symbol" w:hint="default"/>
+      </w:rPr>
+    </w:lvl>
+    <w:lvl w:ilvl="4" w:tplc="08090003" w:tentative="1">
+      <w:start w:val="1"/>
+      <w:numFmt w:val="bullet"/>
+      <w:lvlText w:val="o"/>
+      <w:lvlJc w:val="left"/>
+      <w:pPr>
+        <w:ind w:left="3600" w:hanging="360"/>
+      </w:pPr>
+      <w:rPr>
+        <w:rFonts w:ascii="Courier New" w:hAnsi="Courier New" w:cs="Courier New" w:hint="default"/>
+      </w:rPr>
+    </w:lvl>
+    <w:lvl w:ilvl="5" w:tplc="08090005" w:tentative="1">
+      <w:start w:val="1"/>
+      <w:numFmt w:val="bullet"/>
+      <w:lvlText w:val=""/>
+      <w:lvlJc w:val="left"/>
+      <w:pPr>
+        <w:ind w:left="4320" w:hanging="360"/>
+      </w:pPr>
+      <w:rPr>
+        <w:rFonts w:ascii="Wingdings" w:hAnsi="Wingdings" w:hint="default"/>
+      </w:rPr>
+    </w:lvl>
+    <w:lvl w:ilvl="6" w:tplc="08090001" w:tentative="1">
+      <w:start w:val="1"/>
+      <w:numFmt w:val="bullet"/>
+      <w:lvlText w:val=""/>
+      <w:lvlJc w:val="left"/>
+      <w:pPr>
+        <w:ind w:left="5040" w:hanging="360"/>
+      </w:pPr>
+      <w:rPr>
+        <w:rFonts w:ascii="Symbol" w:hAnsi="Symbol" w:hint="default"/>
+      </w:rPr>
+    </w:lvl>
+    <w:lvl w:ilvl="7" w:tplc="08090003" w:tentative="1">
+      <w:start w:val="1"/>
+      <w:numFmt w:val="bullet"/>
+      <w:lvlText w:val="o"/>
+      <w:lvlJc w:val="left"/>
+      <w:pPr>
+        <w:ind w:left="5760" w:hanging="360"/>
+      </w:pPr>
+      <w:rPr>
+        <w:rFonts w:ascii="Courier New" w:hAnsi="Courier New" w:cs="Courier New" w:hint="default"/>
+      </w:rPr>
+    </w:lvl>
+    <w:lvl w:ilvl="8" w:tplc="08090005" w:tentative="1">
+      <w:start w:val="1"/>
+      <w:numFmt w:val="bullet"/>
+      <w:lvlText w:val=""/>
+      <w:lvlJc w:val="left"/>
+      <w:pPr>
+        <w:ind w:left="6480" w:hanging="360"/>
+      </w:pPr>
+      <w:rPr>
+        <w:rFonts w:ascii="Wingdings" w:hAnsi="Wingdings" w:hint="default"/>
+      </w:rPr>
+    </w:lvl>
+  </w:abstractNum>
+  <w:num w:numId="1" w16cid:durableId="1282105287">
+    <w:abstractNumId w:val="0"/>
+  </w:num>
+</w:numbering>
 </file>
 
 <file path=word/styles.xml><?xml version="1.0" encoding="utf-8"?>

</xml_diff>

<commit_message>
Update KiCad schematic and PCB to v1.3
Add new KiCad schematic 'GORAT circuit diagram 1.3.kicad_sch' and v1.3 PCB/project files; modify existing GORAT schematic, PCB (.kicad_pcb) and project library (.kicad_prl). Add multiple backup ZIP archives, remove an autosave temp file, and update Build_Guide.docx. Prepares project files for the v1.3 schematic/PCB update and cleans up temporary autosave artifacts.
</commit_message>
<xml_diff>
--- a/Build_Guide.docx
+++ b/Build_Guide.docx
@@ -244,33 +244,7 @@
                 <w:lang w:eastAsia="en-GB"/>
                 <w14:ligatures w14:val="none"/>
               </w:rPr>
-              <w:t>C</w:t>
-            </w:r>
-            <w:proofErr w:type="gramStart"/>
-            <w:r>
-              <w:rPr>
-                <w:rFonts w:ascii="Aptos Narrow" w:eastAsia="Times New Roman" w:hAnsi="Aptos Narrow" w:cs="Times New Roman"/>
-                <w:color w:val="000000"/>
-                <w:kern w:val="0"/>
-                <w:sz w:val="22"/>
-                <w:szCs w:val="22"/>
-                <w:lang w:eastAsia="en-GB"/>
-                <w14:ligatures w14:val="none"/>
-              </w:rPr>
-              <w:t>1,C</w:t>
-            </w:r>
-            <w:proofErr w:type="gramEnd"/>
-            <w:r>
-              <w:rPr>
-                <w:rFonts w:ascii="Aptos Narrow" w:eastAsia="Times New Roman" w:hAnsi="Aptos Narrow" w:cs="Times New Roman"/>
-                <w:color w:val="000000"/>
-                <w:kern w:val="0"/>
-                <w:sz w:val="22"/>
-                <w:szCs w:val="22"/>
-                <w:lang w:eastAsia="en-GB"/>
-                <w14:ligatures w14:val="none"/>
-              </w:rPr>
-              <w:t>9</w:t>
+              <w:t>C1,C9</w:t>
             </w:r>
           </w:p>
         </w:tc>
@@ -942,33 +916,7 @@
                 <w:lang w:eastAsia="en-GB"/>
                 <w14:ligatures w14:val="none"/>
               </w:rPr>
-              <w:t>C</w:t>
-            </w:r>
-            <w:proofErr w:type="gramStart"/>
-            <w:r>
-              <w:rPr>
-                <w:rFonts w:ascii="Aptos Narrow" w:eastAsia="Times New Roman" w:hAnsi="Aptos Narrow" w:cs="Times New Roman"/>
-                <w:color w:val="000000"/>
-                <w:kern w:val="0"/>
-                <w:sz w:val="22"/>
-                <w:szCs w:val="22"/>
-                <w:lang w:eastAsia="en-GB"/>
-                <w14:ligatures w14:val="none"/>
-              </w:rPr>
-              <w:t>6,C</w:t>
-            </w:r>
-            <w:proofErr w:type="gramEnd"/>
-            <w:r>
-              <w:rPr>
-                <w:rFonts w:ascii="Aptos Narrow" w:eastAsia="Times New Roman" w:hAnsi="Aptos Narrow" w:cs="Times New Roman"/>
-                <w:color w:val="000000"/>
-                <w:kern w:val="0"/>
-                <w:sz w:val="22"/>
-                <w:szCs w:val="22"/>
-                <w:lang w:eastAsia="en-GB"/>
-                <w14:ligatures w14:val="none"/>
-              </w:rPr>
-              <w:t>7</w:t>
+              <w:t>C6,C7</w:t>
             </w:r>
           </w:p>
         </w:tc>
@@ -1304,33 +1252,7 @@
                 <w:lang w:eastAsia="en-GB"/>
                 <w14:ligatures w14:val="none"/>
               </w:rPr>
-              <w:t>C</w:t>
-            </w:r>
-            <w:proofErr w:type="gramStart"/>
-            <w:r>
-              <w:rPr>
-                <w:rFonts w:ascii="Aptos Narrow" w:eastAsia="Times New Roman" w:hAnsi="Aptos Narrow" w:cs="Times New Roman"/>
-                <w:color w:val="000000"/>
-                <w:kern w:val="0"/>
-                <w:sz w:val="22"/>
-                <w:szCs w:val="22"/>
-                <w:lang w:eastAsia="en-GB"/>
-                <w14:ligatures w14:val="none"/>
-              </w:rPr>
-              <w:t>10,C13,C</w:t>
-            </w:r>
-            <w:proofErr w:type="gramEnd"/>
-            <w:r>
-              <w:rPr>
-                <w:rFonts w:ascii="Aptos Narrow" w:eastAsia="Times New Roman" w:hAnsi="Aptos Narrow" w:cs="Times New Roman"/>
-                <w:color w:val="000000"/>
-                <w:kern w:val="0"/>
-                <w:sz w:val="22"/>
-                <w:szCs w:val="22"/>
-                <w:lang w:eastAsia="en-GB"/>
-                <w14:ligatures w14:val="none"/>
-              </w:rPr>
-              <w:t>19</w:t>
+              <w:t>C10,C13,C19</w:t>
             </w:r>
           </w:p>
         </w:tc>
@@ -3010,33 +2932,7 @@
                 <w:lang w:eastAsia="en-GB"/>
                 <w14:ligatures w14:val="none"/>
               </w:rPr>
-              <w:t>D</w:t>
-            </w:r>
-            <w:proofErr w:type="gramStart"/>
-            <w:r>
-              <w:rPr>
-                <w:rFonts w:ascii="Aptos Narrow" w:eastAsia="Times New Roman" w:hAnsi="Aptos Narrow" w:cs="Times New Roman"/>
-                <w:color w:val="000000"/>
-                <w:kern w:val="0"/>
-                <w:sz w:val="22"/>
-                <w:szCs w:val="22"/>
-                <w:lang w:eastAsia="en-GB"/>
-                <w14:ligatures w14:val="none"/>
-              </w:rPr>
-              <w:t>1,D</w:t>
-            </w:r>
-            <w:proofErr w:type="gramEnd"/>
-            <w:r>
-              <w:rPr>
-                <w:rFonts w:ascii="Aptos Narrow" w:eastAsia="Times New Roman" w:hAnsi="Aptos Narrow" w:cs="Times New Roman"/>
-                <w:color w:val="000000"/>
-                <w:kern w:val="0"/>
-                <w:sz w:val="22"/>
-                <w:szCs w:val="22"/>
-                <w:lang w:eastAsia="en-GB"/>
-                <w14:ligatures w14:val="none"/>
-              </w:rPr>
-              <w:t>2</w:t>
+              <w:t>D1,D2</w:t>
             </w:r>
           </w:p>
         </w:tc>
@@ -3372,33 +3268,7 @@
                 <w:lang w:eastAsia="en-GB"/>
                 <w14:ligatures w14:val="none"/>
               </w:rPr>
-              <w:t>D</w:t>
-            </w:r>
-            <w:proofErr w:type="gramStart"/>
-            <w:r>
-              <w:rPr>
-                <w:rFonts w:ascii="Aptos Narrow" w:eastAsia="Times New Roman" w:hAnsi="Aptos Narrow" w:cs="Times New Roman"/>
-                <w:color w:val="000000"/>
-                <w:kern w:val="0"/>
-                <w:sz w:val="22"/>
-                <w:szCs w:val="22"/>
-                <w:lang w:eastAsia="en-GB"/>
-                <w14:ligatures w14:val="none"/>
-              </w:rPr>
-              <w:t>4,D5,D</w:t>
-            </w:r>
-            <w:proofErr w:type="gramEnd"/>
-            <w:r>
-              <w:rPr>
-                <w:rFonts w:ascii="Aptos Narrow" w:eastAsia="Times New Roman" w:hAnsi="Aptos Narrow" w:cs="Times New Roman"/>
-                <w:color w:val="000000"/>
-                <w:kern w:val="0"/>
-                <w:sz w:val="22"/>
-                <w:szCs w:val="22"/>
-                <w:lang w:eastAsia="en-GB"/>
-                <w14:ligatures w14:val="none"/>
-              </w:rPr>
-              <w:t>6</w:t>
+              <w:t>D4,D5,D6</w:t>
             </w:r>
           </w:p>
         </w:tc>
@@ -3567,33 +3437,7 @@
                 <w:lang w:eastAsia="en-GB"/>
                 <w14:ligatures w14:val="none"/>
               </w:rPr>
-              <w:t>D</w:t>
-            </w:r>
-            <w:proofErr w:type="gramStart"/>
-            <w:r>
-              <w:rPr>
-                <w:rFonts w:ascii="Aptos Narrow" w:eastAsia="Times New Roman" w:hAnsi="Aptos Narrow" w:cs="Times New Roman"/>
-                <w:color w:val="000000"/>
-                <w:kern w:val="0"/>
-                <w:sz w:val="22"/>
-                <w:szCs w:val="22"/>
-                <w:lang w:eastAsia="en-GB"/>
-                <w14:ligatures w14:val="none"/>
-              </w:rPr>
-              <w:t>7,D</w:t>
-            </w:r>
-            <w:proofErr w:type="gramEnd"/>
-            <w:r>
-              <w:rPr>
-                <w:rFonts w:ascii="Aptos Narrow" w:eastAsia="Times New Roman" w:hAnsi="Aptos Narrow" w:cs="Times New Roman"/>
-                <w:color w:val="000000"/>
-                <w:kern w:val="0"/>
-                <w:sz w:val="22"/>
-                <w:szCs w:val="22"/>
-                <w:lang w:eastAsia="en-GB"/>
-                <w14:ligatures w14:val="none"/>
-              </w:rPr>
-              <w:t>8</w:t>
+              <w:t>D7,D8</w:t>
             </w:r>
           </w:p>
         </w:tc>
@@ -3760,33 +3604,7 @@
                 <w:lang w:eastAsia="en-GB"/>
                 <w14:ligatures w14:val="none"/>
               </w:rPr>
-              <w:t>J</w:t>
-            </w:r>
-            <w:proofErr w:type="gramStart"/>
-            <w:r>
-              <w:rPr>
-                <w:rFonts w:ascii="Aptos Narrow" w:eastAsia="Times New Roman" w:hAnsi="Aptos Narrow" w:cs="Times New Roman"/>
-                <w:color w:val="000000"/>
-                <w:kern w:val="0"/>
-                <w:sz w:val="22"/>
-                <w:szCs w:val="22"/>
-                <w:lang w:eastAsia="en-GB"/>
-                <w14:ligatures w14:val="none"/>
-              </w:rPr>
-              <w:t>1,J</w:t>
-            </w:r>
-            <w:proofErr w:type="gramEnd"/>
-            <w:r>
-              <w:rPr>
-                <w:rFonts w:ascii="Aptos Narrow" w:eastAsia="Times New Roman" w:hAnsi="Aptos Narrow" w:cs="Times New Roman"/>
-                <w:color w:val="000000"/>
-                <w:kern w:val="0"/>
-                <w:sz w:val="22"/>
-                <w:szCs w:val="22"/>
-                <w:lang w:eastAsia="en-GB"/>
-                <w14:ligatures w14:val="none"/>
-              </w:rPr>
-              <w:t>2</w:t>
+              <w:t>J1,J2</w:t>
             </w:r>
           </w:p>
         </w:tc>
@@ -3985,7 +3803,6 @@
                 <w14:ligatures w14:val="none"/>
               </w:rPr>
             </w:pPr>
-            <w:proofErr w:type="spellStart"/>
             <w:r>
               <w:rPr>
                 <w:rFonts w:ascii="Aptos Narrow" w:eastAsia="Times New Roman" w:hAnsi="Aptos Narrow" w:cs="Times New Roman"/>
@@ -3998,7 +3815,6 @@
               </w:rPr>
               <w:t>Barrel_Jack</w:t>
             </w:r>
-            <w:proofErr w:type="spellEnd"/>
           </w:p>
         </w:tc>
         <w:tc>
@@ -4293,33 +4109,7 @@
                 <w:lang w:eastAsia="en-GB"/>
                 <w14:ligatures w14:val="none"/>
               </w:rPr>
-              <w:t>R</w:t>
-            </w:r>
-            <w:proofErr w:type="gramStart"/>
-            <w:r>
-              <w:rPr>
-                <w:rFonts w:ascii="Aptos Narrow" w:eastAsia="Times New Roman" w:hAnsi="Aptos Narrow" w:cs="Times New Roman"/>
-                <w:color w:val="000000"/>
-                <w:kern w:val="0"/>
-                <w:sz w:val="22"/>
-                <w:szCs w:val="22"/>
-                <w:lang w:eastAsia="en-GB"/>
-                <w14:ligatures w14:val="none"/>
-              </w:rPr>
-              <w:t>1,R2,R8,R14,R</w:t>
-            </w:r>
-            <w:proofErr w:type="gramEnd"/>
-            <w:r>
-              <w:rPr>
-                <w:rFonts w:ascii="Aptos Narrow" w:eastAsia="Times New Roman" w:hAnsi="Aptos Narrow" w:cs="Times New Roman"/>
-                <w:color w:val="000000"/>
-                <w:kern w:val="0"/>
-                <w:sz w:val="22"/>
-                <w:szCs w:val="22"/>
-                <w:lang w:eastAsia="en-GB"/>
-                <w14:ligatures w14:val="none"/>
-              </w:rPr>
-              <w:t>18</w:t>
+              <w:t>R1,R2,R8,R14,R18</w:t>
             </w:r>
           </w:p>
         </w:tc>
@@ -4486,33 +4276,7 @@
                 <w:lang w:eastAsia="en-GB"/>
                 <w14:ligatures w14:val="none"/>
               </w:rPr>
-              <w:t>R</w:t>
-            </w:r>
-            <w:proofErr w:type="gramStart"/>
-            <w:r>
-              <w:rPr>
-                <w:rFonts w:ascii="Aptos Narrow" w:eastAsia="Times New Roman" w:hAnsi="Aptos Narrow" w:cs="Times New Roman"/>
-                <w:color w:val="000000"/>
-                <w:kern w:val="0"/>
-                <w:sz w:val="22"/>
-                <w:szCs w:val="22"/>
-                <w:lang w:eastAsia="en-GB"/>
-                <w14:ligatures w14:val="none"/>
-              </w:rPr>
-              <w:t>3,R</w:t>
-            </w:r>
-            <w:proofErr w:type="gramEnd"/>
-            <w:r>
-              <w:rPr>
-                <w:rFonts w:ascii="Aptos Narrow" w:eastAsia="Times New Roman" w:hAnsi="Aptos Narrow" w:cs="Times New Roman"/>
-                <w:color w:val="000000"/>
-                <w:kern w:val="0"/>
-                <w:sz w:val="22"/>
-                <w:szCs w:val="22"/>
-                <w:lang w:eastAsia="en-GB"/>
-                <w14:ligatures w14:val="none"/>
-              </w:rPr>
-              <w:t>6</w:t>
+              <w:t>R3,R6</w:t>
             </w:r>
           </w:p>
         </w:tc>
@@ -4681,33 +4445,7 @@
                 <w:lang w:eastAsia="en-GB"/>
                 <w14:ligatures w14:val="none"/>
               </w:rPr>
-              <w:t>R</w:t>
-            </w:r>
-            <w:proofErr w:type="gramStart"/>
-            <w:r>
-              <w:rPr>
-                <w:rFonts w:ascii="Aptos Narrow" w:eastAsia="Times New Roman" w:hAnsi="Aptos Narrow" w:cs="Times New Roman"/>
-                <w:color w:val="000000"/>
-                <w:kern w:val="0"/>
-                <w:sz w:val="22"/>
-                <w:szCs w:val="22"/>
-                <w:lang w:eastAsia="en-GB"/>
-                <w14:ligatures w14:val="none"/>
-              </w:rPr>
-              <w:t>4,R</w:t>
-            </w:r>
-            <w:proofErr w:type="gramEnd"/>
-            <w:r>
-              <w:rPr>
-                <w:rFonts w:ascii="Aptos Narrow" w:eastAsia="Times New Roman" w:hAnsi="Aptos Narrow" w:cs="Times New Roman"/>
-                <w:color w:val="000000"/>
-                <w:kern w:val="0"/>
-                <w:sz w:val="22"/>
-                <w:szCs w:val="22"/>
-                <w:lang w:eastAsia="en-GB"/>
-                <w14:ligatures w14:val="none"/>
-              </w:rPr>
-              <w:t>10</w:t>
+              <w:t>R4,R10</w:t>
             </w:r>
           </w:p>
         </w:tc>
@@ -5379,33 +5117,7 @@
                 <w:lang w:eastAsia="en-GB"/>
                 <w14:ligatures w14:val="none"/>
               </w:rPr>
-              <w:t>R</w:t>
-            </w:r>
-            <w:proofErr w:type="gramStart"/>
-            <w:r>
-              <w:rPr>
-                <w:rFonts w:ascii="Aptos Narrow" w:eastAsia="Times New Roman" w:hAnsi="Aptos Narrow" w:cs="Times New Roman"/>
-                <w:color w:val="000000"/>
-                <w:kern w:val="0"/>
-                <w:sz w:val="22"/>
-                <w:szCs w:val="22"/>
-                <w:lang w:eastAsia="en-GB"/>
-                <w14:ligatures w14:val="none"/>
-              </w:rPr>
-              <w:t>11,R</w:t>
-            </w:r>
-            <w:proofErr w:type="gramEnd"/>
-            <w:r>
-              <w:rPr>
-                <w:rFonts w:ascii="Aptos Narrow" w:eastAsia="Times New Roman" w:hAnsi="Aptos Narrow" w:cs="Times New Roman"/>
-                <w:color w:val="000000"/>
-                <w:kern w:val="0"/>
-                <w:sz w:val="22"/>
-                <w:szCs w:val="22"/>
-                <w:lang w:eastAsia="en-GB"/>
-                <w14:ligatures w14:val="none"/>
-              </w:rPr>
-              <w:t>12</w:t>
+              <w:t>R11,R12</w:t>
             </w:r>
           </w:p>
         </w:tc>
@@ -5741,33 +5453,7 @@
                 <w:lang w:eastAsia="en-GB"/>
                 <w14:ligatures w14:val="none"/>
               </w:rPr>
-              <w:t>R</w:t>
-            </w:r>
-            <w:proofErr w:type="gramStart"/>
-            <w:r>
-              <w:rPr>
-                <w:rFonts w:ascii="Aptos Narrow" w:eastAsia="Times New Roman" w:hAnsi="Aptos Narrow" w:cs="Times New Roman"/>
-                <w:color w:val="000000"/>
-                <w:kern w:val="0"/>
-                <w:sz w:val="22"/>
-                <w:szCs w:val="22"/>
-                <w:lang w:eastAsia="en-GB"/>
-                <w14:ligatures w14:val="none"/>
-              </w:rPr>
-              <w:t>15,R16,R</w:t>
-            </w:r>
-            <w:proofErr w:type="gramEnd"/>
-            <w:r>
-              <w:rPr>
-                <w:rFonts w:ascii="Aptos Narrow" w:eastAsia="Times New Roman" w:hAnsi="Aptos Narrow" w:cs="Times New Roman"/>
-                <w:color w:val="000000"/>
-                <w:kern w:val="0"/>
-                <w:sz w:val="22"/>
-                <w:szCs w:val="22"/>
-                <w:lang w:eastAsia="en-GB"/>
-                <w14:ligatures w14:val="none"/>
-              </w:rPr>
-              <w:t>17</w:t>
+              <w:t>R15,R16,R17</w:t>
             </w:r>
           </w:p>
         </w:tc>
@@ -5934,33 +5620,7 @@
                 <w:lang w:eastAsia="en-GB"/>
                 <w14:ligatures w14:val="none"/>
               </w:rPr>
-              <w:t>RV1-GAIN</w:t>
-            </w:r>
-            <w:proofErr w:type="gramStart"/>
-            <w:r>
-              <w:rPr>
-                <w:rFonts w:ascii="Aptos Narrow" w:eastAsia="Times New Roman" w:hAnsi="Aptos Narrow" w:cs="Times New Roman"/>
-                <w:color w:val="000000"/>
-                <w:kern w:val="0"/>
-                <w:sz w:val="22"/>
-                <w:szCs w:val="22"/>
-                <w:lang w:eastAsia="en-GB"/>
-                <w14:ligatures w14:val="none"/>
-              </w:rPr>
-              <w:t>1,RV</w:t>
-            </w:r>
-            <w:proofErr w:type="gramEnd"/>
-            <w:r>
-              <w:rPr>
-                <w:rFonts w:ascii="Aptos Narrow" w:eastAsia="Times New Roman" w:hAnsi="Aptos Narrow" w:cs="Times New Roman"/>
-                <w:color w:val="000000"/>
-                <w:kern w:val="0"/>
-                <w:sz w:val="22"/>
-                <w:szCs w:val="22"/>
-                <w:lang w:eastAsia="en-GB"/>
-                <w14:ligatures w14:val="none"/>
-              </w:rPr>
-              <w:t>2-FILTER1</w:t>
+              <w:t>RV1-GAIN1,RV2-FILTER1</w:t>
             </w:r>
           </w:p>
         </w:tc>
@@ -7115,31 +6775,17 @@
                 <w14:ligatures w14:val="none"/>
               </w:rPr>
             </w:pPr>
-            <w:proofErr w:type="gramStart"/>
-            <w:r>
-              <w:rPr>
-                <w:rFonts w:ascii="Aptos Narrow" w:eastAsia="Times New Roman" w:hAnsi="Aptos Narrow" w:cs="Times New Roman"/>
-                <w:color w:val="000000"/>
-                <w:kern w:val="0"/>
-                <w:sz w:val="22"/>
-                <w:szCs w:val="22"/>
-                <w:lang w:eastAsia="en-GB"/>
-                <w14:ligatures w14:val="none"/>
-              </w:rPr>
-              <w:t>U2,U</w:t>
-            </w:r>
-            <w:proofErr w:type="gramEnd"/>
-            <w:r>
-              <w:rPr>
-                <w:rFonts w:ascii="Aptos Narrow" w:eastAsia="Times New Roman" w:hAnsi="Aptos Narrow" w:cs="Times New Roman"/>
-                <w:color w:val="000000"/>
-                <w:kern w:val="0"/>
-                <w:sz w:val="22"/>
-                <w:szCs w:val="22"/>
-                <w:lang w:eastAsia="en-GB"/>
-                <w14:ligatures w14:val="none"/>
-              </w:rPr>
-              <w:t>3</w:t>
+            <w:r>
+              <w:rPr>
+                <w:rFonts w:ascii="Aptos Narrow" w:eastAsia="Times New Roman" w:hAnsi="Aptos Narrow" w:cs="Times New Roman"/>
+                <w:color w:val="000000"/>
+                <w:kern w:val="0"/>
+                <w:sz w:val="22"/>
+                <w:szCs w:val="22"/>
+                <w:lang w:eastAsia="en-GB"/>
+                <w14:ligatures w14:val="none"/>
+              </w:rPr>
+              <w:t>U2,U3</w:t>
             </w:r>
           </w:p>
         </w:tc>
@@ -7470,15 +7116,7 @@
         <w:t xml:space="preserve"> from the main board</w:t>
       </w:r>
       <w:r>
-        <w:t xml:space="preserve"> (1: the meat and potatoes). The </w:t>
-      </w:r>
-      <w:proofErr w:type="gramStart"/>
-      <w:r>
-        <w:t>break-points</w:t>
-      </w:r>
-      <w:proofErr w:type="gramEnd"/>
-      <w:r>
-        <w:t xml:space="preserve"> are labelled on the bottom side of the board.</w:t>
+        <w:t xml:space="preserve"> (1: the meat and potatoes). The break-points are labelled on the bottom side of the board.</w:t>
       </w:r>
     </w:p>
     <w:p>
@@ -7534,13 +7172,7 @@
         <w:rPr>
           <w:highlight w:val="green"/>
         </w:rPr>
-        <w:t>C1(1) and J3(4), and between C19(2) and J3(5)</w:t>
-      </w:r>
-      <w:r>
-        <w:rPr>
-          <w:highlight w:val="green"/>
-        </w:rPr>
-        <w:t>, signal in and out of circuit.</w:t>
+        <w:t>C1(1) and J3(4), and between C19(2) and J3(5), signal in and out of circuit.</w:t>
       </w:r>
     </w:p>
     <w:p>
@@ -7555,13 +7187,8 @@
         <w:t>Test points</w:t>
       </w:r>
       <w:r>
-        <w:t xml:space="preserve"> more </w:t>
+        <w:t xml:space="preserve"> more obvious?</w:t>
       </w:r>
-      <w:proofErr w:type="gramStart"/>
-      <w:r>
-        <w:t>obvious?</w:t>
-      </w:r>
-      <w:proofErr w:type="gramEnd"/>
     </w:p>
     <w:p>
       <w:pPr>
@@ -7578,35 +7205,7 @@
         <w:rPr>
           <w:highlight w:val="green"/>
         </w:rPr>
-        <w:t>Rotary switch footprints (</w:t>
-      </w:r>
-      <w:proofErr w:type="gramStart"/>
-      <w:r>
-        <w:rPr>
-          <w:highlight w:val="green"/>
-        </w:rPr>
-        <w:t>A,B</w:t>
-      </w:r>
-      <w:proofErr w:type="gramEnd"/>
-      <w:r>
-        <w:rPr>
-          <w:highlight w:val="green"/>
-        </w:rPr>
-        <w:t>,</w:t>
-      </w:r>
-      <w:proofErr w:type="gramStart"/>
-      <w:r>
-        <w:rPr>
-          <w:highlight w:val="green"/>
-        </w:rPr>
-        <w:t>C,D</w:t>
-      </w:r>
-      <w:proofErr w:type="gramEnd"/>
-      <w:r>
-        <w:rPr>
-          <w:highlight w:val="green"/>
-        </w:rPr>
-        <w:t>, get placement correct, line up pin 1)</w:t>
+        <w:t>Rotary switch footprints (A,B,C,D, get placement correct, line up pin 1)</w:t>
       </w:r>
     </w:p>
     <w:p>
@@ -7697,6 +7296,18 @@
           <w:highlight w:val="green"/>
         </w:rPr>
         <w:t>in wrong configuration, input into -)</w:t>
+      </w:r>
+      <w:r>
+        <w:rPr>
+          <w:highlight w:val="green"/>
+        </w:rPr>
+        <w:t xml:space="preserve"> </w:t>
+      </w:r>
+      <w:r>
+        <w:t>Al</w:t>
+      </w:r>
+      <w:r>
+        <w:t>so check biasing of this section…</w:t>
       </w:r>
     </w:p>
     <w:p>
@@ -8299,7 +7910,6 @@
         <w:szCs w:val="32"/>
       </w:rPr>
     </w:pPr>
-    <w:proofErr w:type="spellStart"/>
     <w:r>
       <w:rPr>
         <w:rFonts w:asciiTheme="majorHAnsi" w:hAnsiTheme="majorHAnsi"/>
@@ -8308,18 +7918,7 @@
         <w:sz w:val="32"/>
         <w:szCs w:val="32"/>
       </w:rPr>
-      <w:t>GoRAT</w:t>
-    </w:r>
-    <w:proofErr w:type="spellEnd"/>
-    <w:r>
-      <w:rPr>
-        <w:rFonts w:asciiTheme="majorHAnsi" w:hAnsiTheme="majorHAnsi"/>
-        <w:b/>
-        <w:bCs/>
-        <w:sz w:val="32"/>
-        <w:szCs w:val="32"/>
-      </w:rPr>
-      <w:t xml:space="preserve"> Distortion Pedal</w:t>
+      <w:t>GoRAT Distortion Pedal</w:t>
     </w:r>
     <w:r>
       <w:rPr>

</xml_diff>